<commit_message>
Ngữ văn 10-12 Bài 1, 2: bổ sung video học liệu (đã kiểm tra liên kết) vào KHBD và slide
Co-Authored-By: Claude Opus 5.5 <noreply@anthropic.com>
</commit_message>
<xml_diff>
--- a/mon/ngu_van/khbd/lop10/KHBD_NGUVAN10_Bai2_VeDepCuaThoCa_T12-22.docx
+++ b/mon/ngu_van/khbd/lop10/KHBD_NGUVAN10_Bai2_VeDepCuaThoCa_T12-22.docx
@@ -723,6 +723,19 @@
           <w:i w:val="0"/>
         </w:rPr>
         <w:t>- GV dẫn vào bài: Có những bài thơ chỉ vỏn vẹn ba dòng mà khiến người đọc nghĩ mãi – đó là thơ hai-cư của Nhật Bản.</w:t>
+      </w:r>
+    </w:p>
+    <w:p>
+      <w:pPr>
+        <w:spacing w:before="0" w:after="0"/>
+        <w:jc w:val="both"/>
+      </w:pPr>
+      <w:r>
+        <w:rPr>
+          <w:b w:val="0"/>
+          <w:i w:val="0"/>
+        </w:rPr>
+        <w:t>- Video tham khảo: Matsuo Bashō – Người khai sáng thơ Haiku Nhật Bản (kênh Người Nổi Tiếng) – https://www.youtube.com/watch?v=uS7Hxn7RKDo – Tìm hiểu tác giả Ba-sô, thể thơ hai-cư</w:t>
       </w:r>
     </w:p>
     <w:p>
@@ -1406,6 +1419,19 @@
           <w:i w:val="0"/>
         </w:rPr>
         <w:t>- GV dẫn vào bài: Mùa thu năm 766, Đỗ Phủ đang phiêu bạt ở Quỳ Châu, ốm đau, khốn khó; chùm Thu hứng ra đời, chất chứa nỗi nhớ quê và nỗi đau thời thế.</w:t>
+      </w:r>
+    </w:p>
+    <w:p>
+      <w:pPr>
+        <w:spacing w:before="0" w:after="0"/>
+        <w:jc w:val="both"/>
+      </w:pPr>
+      <w:r>
+        <w:rPr>
+          <w:b w:val="0"/>
+          <w:i w:val="0"/>
+        </w:rPr>
+        <w:t>- Video tham khảo: Cảm xúc mùa thu (Thu hứng bài 1, Đỗ Phủ) – Ngữ văn 10 KNTT (kênh Học liệu số giáo dục) – https://www.youtube.com/watch?v=WJr3ux-UmG4 – Đọc, tìm hiểu Thu hứng</w:t>
       </w:r>
     </w:p>
     <w:p>
@@ -2587,6 +2613,19 @@
     </w:p>
     <w:p>
       <w:pPr>
+        <w:spacing w:before="0" w:after="0"/>
+        <w:jc w:val="both"/>
+      </w:pPr>
+      <w:r>
+        <w:rPr>
+          <w:b w:val="0"/>
+          <w:i w:val="0"/>
+        </w:rPr>
+        <w:t>- Video tham khảo: Bài thơ Mùa xuân chín – Hàn Mặc Tử – NSƯT Trần Thị Tuyết diễn ngâm (kênh Lê &amp; H) – https://www.youtube.com/watch?v=Qvss02_9RAk – Đọc diễn cảm Mùa xuân chín</w:t>
+      </w:r>
+    </w:p>
+    <w:p>
+      <w:pPr>
         <w:spacing w:before="80" w:after="0"/>
         <w:jc w:val="center"/>
       </w:pPr>
@@ -3106,6 +3145,19 @@
     </w:p>
     <w:p>
       <w:pPr>
+        <w:spacing w:before="0" w:after="0"/>
+        <w:jc w:val="both"/>
+      </w:pPr>
+      <w:r>
+        <w:rPr>
+          <w:b w:val="0"/>
+          <w:i w:val="0"/>
+        </w:rPr>
+        <w:t>- Video tham khảo: Bài thơ Tiếng thu – Lưu Trọng Lư – Ngọc Sang diễn ngâm (kênh Nghệ sĩ ngâm thơ Ngọc Sang) – https://www.youtube.com/watch?v=c5RVyHI_TeU – Mở đầu Văn bản 6 (thay cho bài hát phổ thơ)</w:t>
+      </w:r>
+    </w:p>
+    <w:p>
+      <w:pPr>
         <w:spacing w:before="80" w:after="0"/>
         <w:jc w:val="center"/>
       </w:pPr>
@@ -4211,6 +4263,598 @@
         </w:rPr>
         <w:t>* PHỤ LỤC</w:t>
       </w:r>
+    </w:p>
+    <w:p>
+      <w:pPr>
+        <w:spacing w:before="80" w:after="0"/>
+        <w:jc w:val="center"/>
+      </w:pPr>
+      <w:r>
+        <w:rPr>
+          <w:b/>
+          <w:i w:val="0"/>
+        </w:rPr>
+        <w:t>Học liệu video (đã kiểm tra liên kết)</w:t>
+      </w:r>
+    </w:p>
+    <w:tbl>
+      <w:tblPr>
+        <w:tblStyle w:val="TableGrid"/>
+        <w:tblW w:type="auto" w:w="0"/>
+        <w:jc w:val="center"/>
+        <w:tblLayout w:type="fixed"/>
+        <w:tblLook w:firstColumn="1" w:firstRow="1" w:lastColumn="0" w:lastRow="0" w:noHBand="0" w:noVBand="1" w:val="04A0"/>
+      </w:tblPr>
+      <w:tblGrid>
+        <w:gridCol w:w="1985"/>
+        <w:gridCol w:w="1985"/>
+        <w:gridCol w:w="1985"/>
+        <w:gridCol w:w="1985"/>
+        <w:gridCol w:w="1985"/>
+      </w:tblGrid>
+      <w:tr>
+        <w:tc>
+          <w:tcPr>
+            <w:tcW w:type="dxa" w:w="794"/>
+            <w:shd w:val="clear" w:color="auto" w:fill="DCE6F2"/>
+          </w:tcPr>
+          <w:p>
+            <w:pPr>
+              <w:spacing w:before="80" w:after="0"/>
+              <w:jc w:val="center"/>
+            </w:pPr>
+            <w:r>
+              <w:rPr>
+                <w:b/>
+                <w:i w:val="0"/>
+              </w:rPr>
+              <w:t>STT</w:t>
+            </w:r>
+          </w:p>
+        </w:tc>
+        <w:tc>
+          <w:tcPr>
+            <w:tcW w:type="dxa" w:w="2282"/>
+            <w:shd w:val="clear" w:color="auto" w:fill="DCE6F2"/>
+          </w:tcPr>
+          <w:p>
+            <w:pPr>
+              <w:spacing w:before="80" w:after="0"/>
+              <w:jc w:val="center"/>
+            </w:pPr>
+            <w:r>
+              <w:rPr>
+                <w:b/>
+                <w:i w:val="0"/>
+              </w:rPr>
+              <w:t>Video</w:t>
+            </w:r>
+          </w:p>
+        </w:tc>
+        <w:tc>
+          <w:tcPr>
+            <w:tcW w:type="dxa" w:w="2282"/>
+            <w:shd w:val="clear" w:color="auto" w:fill="DCE6F2"/>
+          </w:tcPr>
+          <w:p>
+            <w:pPr>
+              <w:spacing w:before="80" w:after="0"/>
+              <w:jc w:val="center"/>
+            </w:pPr>
+            <w:r>
+              <w:rPr>
+                <w:b/>
+                <w:i w:val="0"/>
+              </w:rPr>
+              <w:t>Kênh</w:t>
+            </w:r>
+          </w:p>
+        </w:tc>
+        <w:tc>
+          <w:tcPr>
+            <w:tcW w:type="dxa" w:w="2282"/>
+            <w:shd w:val="clear" w:color="auto" w:fill="DCE6F2"/>
+          </w:tcPr>
+          <w:p>
+            <w:pPr>
+              <w:spacing w:before="80" w:after="0"/>
+              <w:jc w:val="center"/>
+            </w:pPr>
+            <w:r>
+              <w:rPr>
+                <w:b/>
+                <w:i w:val="0"/>
+              </w:rPr>
+              <w:t>Dùng ở</w:t>
+            </w:r>
+          </w:p>
+        </w:tc>
+        <w:tc>
+          <w:tcPr>
+            <w:tcW w:type="dxa" w:w="2282"/>
+            <w:shd w:val="clear" w:color="auto" w:fill="DCE6F2"/>
+          </w:tcPr>
+          <w:p>
+            <w:pPr>
+              <w:spacing w:before="80" w:after="0"/>
+              <w:jc w:val="center"/>
+            </w:pPr>
+            <w:r>
+              <w:rPr>
+                <w:b/>
+                <w:i w:val="0"/>
+              </w:rPr>
+              <w:t>Liên kết</w:t>
+            </w:r>
+          </w:p>
+        </w:tc>
+      </w:tr>
+      <w:tr>
+        <w:tc>
+          <w:tcPr>
+            <w:tcW w:type="dxa" w:w="794"/>
+          </w:tcPr>
+          <w:p>
+            <w:pPr>
+              <w:spacing w:before="0" w:after="0"/>
+              <w:jc w:val="both"/>
+            </w:pPr>
+            <w:r>
+              <w:rPr>
+                <w:b w:val="0"/>
+                <w:i w:val="0"/>
+              </w:rPr>
+              <w:t>1</w:t>
+            </w:r>
+          </w:p>
+        </w:tc>
+        <w:tc>
+          <w:tcPr>
+            <w:tcW w:type="dxa" w:w="2282"/>
+          </w:tcPr>
+          <w:p>
+            <w:pPr>
+              <w:spacing w:before="0" w:after="0"/>
+              <w:jc w:val="both"/>
+            </w:pPr>
+            <w:r>
+              <w:rPr>
+                <w:b w:val="0"/>
+                <w:i w:val="0"/>
+              </w:rPr>
+              <w:t>Matsuo Bashō – Người khai sáng thơ Haiku Nhật Bản</w:t>
+            </w:r>
+          </w:p>
+        </w:tc>
+        <w:tc>
+          <w:tcPr>
+            <w:tcW w:type="dxa" w:w="2282"/>
+          </w:tcPr>
+          <w:p>
+            <w:pPr>
+              <w:spacing w:before="0" w:after="0"/>
+              <w:jc w:val="both"/>
+            </w:pPr>
+            <w:r>
+              <w:rPr>
+                <w:b w:val="0"/>
+                <w:i w:val="0"/>
+              </w:rPr>
+              <w:t>Người Nổi Tiếng</w:t>
+            </w:r>
+          </w:p>
+        </w:tc>
+        <w:tc>
+          <w:tcPr>
+            <w:tcW w:type="dxa" w:w="2282"/>
+          </w:tcPr>
+          <w:p>
+            <w:pPr>
+              <w:spacing w:before="0" w:after="0"/>
+              <w:jc w:val="both"/>
+            </w:pPr>
+            <w:r>
+              <w:rPr>
+                <w:b w:val="0"/>
+                <w:i w:val="0"/>
+              </w:rPr>
+              <w:t>Tìm hiểu tác giả Ba-sô, thể thơ hai-cư</w:t>
+            </w:r>
+          </w:p>
+        </w:tc>
+        <w:tc>
+          <w:tcPr>
+            <w:tcW w:type="dxa" w:w="2282"/>
+          </w:tcPr>
+          <w:p>
+            <w:pPr>
+              <w:spacing w:before="0" w:after="0"/>
+              <w:jc w:val="both"/>
+            </w:pPr>
+            <w:r>
+              <w:rPr>
+                <w:b w:val="0"/>
+                <w:i w:val="0"/>
+              </w:rPr>
+              <w:t>https://www.youtube.com/watch?v=uS7Hxn7RKDo</w:t>
+            </w:r>
+          </w:p>
+        </w:tc>
+      </w:tr>
+      <w:tr>
+        <w:tc>
+          <w:tcPr>
+            <w:tcW w:type="dxa" w:w="794"/>
+          </w:tcPr>
+          <w:p>
+            <w:pPr>
+              <w:spacing w:before="0" w:after="0"/>
+              <w:jc w:val="both"/>
+            </w:pPr>
+            <w:r>
+              <w:rPr>
+                <w:b w:val="0"/>
+                <w:i w:val="0"/>
+              </w:rPr>
+              <w:t>2</w:t>
+            </w:r>
+          </w:p>
+        </w:tc>
+        <w:tc>
+          <w:tcPr>
+            <w:tcW w:type="dxa" w:w="2282"/>
+          </w:tcPr>
+          <w:p>
+            <w:pPr>
+              <w:spacing w:before="0" w:after="0"/>
+              <w:jc w:val="both"/>
+            </w:pPr>
+            <w:r>
+              <w:rPr>
+                <w:b w:val="0"/>
+                <w:i w:val="0"/>
+              </w:rPr>
+              <w:t>Cảm xúc mùa thu (Thu hứng bài 1, Đỗ Phủ) – Ngữ văn 10 KNTT</w:t>
+            </w:r>
+          </w:p>
+        </w:tc>
+        <w:tc>
+          <w:tcPr>
+            <w:tcW w:type="dxa" w:w="2282"/>
+          </w:tcPr>
+          <w:p>
+            <w:pPr>
+              <w:spacing w:before="0" w:after="0"/>
+              <w:jc w:val="both"/>
+            </w:pPr>
+            <w:r>
+              <w:rPr>
+                <w:b w:val="0"/>
+                <w:i w:val="0"/>
+              </w:rPr>
+              <w:t>Học liệu số giáo dục</w:t>
+            </w:r>
+          </w:p>
+        </w:tc>
+        <w:tc>
+          <w:tcPr>
+            <w:tcW w:type="dxa" w:w="2282"/>
+          </w:tcPr>
+          <w:p>
+            <w:pPr>
+              <w:spacing w:before="0" w:after="0"/>
+              <w:jc w:val="both"/>
+            </w:pPr>
+            <w:r>
+              <w:rPr>
+                <w:b w:val="0"/>
+                <w:i w:val="0"/>
+              </w:rPr>
+              <w:t>Đọc, tìm hiểu Thu hứng</w:t>
+            </w:r>
+          </w:p>
+        </w:tc>
+        <w:tc>
+          <w:tcPr>
+            <w:tcW w:type="dxa" w:w="2282"/>
+          </w:tcPr>
+          <w:p>
+            <w:pPr>
+              <w:spacing w:before="0" w:after="0"/>
+              <w:jc w:val="both"/>
+            </w:pPr>
+            <w:r>
+              <w:rPr>
+                <w:b w:val="0"/>
+                <w:i w:val="0"/>
+              </w:rPr>
+              <w:t>https://www.youtube.com/watch?v=WJr3ux-UmG4</w:t>
+            </w:r>
+          </w:p>
+        </w:tc>
+      </w:tr>
+      <w:tr>
+        <w:tc>
+          <w:tcPr>
+            <w:tcW w:type="dxa" w:w="794"/>
+          </w:tcPr>
+          <w:p>
+            <w:pPr>
+              <w:spacing w:before="0" w:after="0"/>
+              <w:jc w:val="both"/>
+            </w:pPr>
+            <w:r>
+              <w:rPr>
+                <w:b w:val="0"/>
+                <w:i w:val="0"/>
+              </w:rPr>
+              <w:t>3</w:t>
+            </w:r>
+          </w:p>
+        </w:tc>
+        <w:tc>
+          <w:tcPr>
+            <w:tcW w:type="dxa" w:w="2282"/>
+          </w:tcPr>
+          <w:p>
+            <w:pPr>
+              <w:spacing w:before="0" w:after="0"/>
+              <w:jc w:val="both"/>
+            </w:pPr>
+            <w:r>
+              <w:rPr>
+                <w:b w:val="0"/>
+                <w:i w:val="0"/>
+              </w:rPr>
+              <w:t>Bài thơ Mùa xuân chín – Hàn Mặc Tử – NSƯT Trần Thị Tuyết diễn ngâm</w:t>
+            </w:r>
+          </w:p>
+        </w:tc>
+        <w:tc>
+          <w:tcPr>
+            <w:tcW w:type="dxa" w:w="2282"/>
+          </w:tcPr>
+          <w:p>
+            <w:pPr>
+              <w:spacing w:before="0" w:after="0"/>
+              <w:jc w:val="both"/>
+            </w:pPr>
+            <w:r>
+              <w:rPr>
+                <w:b w:val="0"/>
+                <w:i w:val="0"/>
+              </w:rPr>
+              <w:t>Lê &amp; H</w:t>
+            </w:r>
+          </w:p>
+        </w:tc>
+        <w:tc>
+          <w:tcPr>
+            <w:tcW w:type="dxa" w:w="2282"/>
+          </w:tcPr>
+          <w:p>
+            <w:pPr>
+              <w:spacing w:before="0" w:after="0"/>
+              <w:jc w:val="both"/>
+            </w:pPr>
+            <w:r>
+              <w:rPr>
+                <w:b w:val="0"/>
+                <w:i w:val="0"/>
+              </w:rPr>
+              <w:t>Đọc diễn cảm Mùa xuân chín</w:t>
+            </w:r>
+          </w:p>
+        </w:tc>
+        <w:tc>
+          <w:tcPr>
+            <w:tcW w:type="dxa" w:w="2282"/>
+          </w:tcPr>
+          <w:p>
+            <w:pPr>
+              <w:spacing w:before="0" w:after="0"/>
+              <w:jc w:val="both"/>
+            </w:pPr>
+            <w:r>
+              <w:rPr>
+                <w:b w:val="0"/>
+                <w:i w:val="0"/>
+              </w:rPr>
+              <w:t>https://www.youtube.com/watch?v=Qvss02_9RAk</w:t>
+            </w:r>
+          </w:p>
+        </w:tc>
+      </w:tr>
+      <w:tr>
+        <w:tc>
+          <w:tcPr>
+            <w:tcW w:type="dxa" w:w="794"/>
+          </w:tcPr>
+          <w:p>
+            <w:pPr>
+              <w:spacing w:before="0" w:after="0"/>
+              <w:jc w:val="both"/>
+            </w:pPr>
+            <w:r>
+              <w:rPr>
+                <w:b w:val="0"/>
+                <w:i w:val="0"/>
+              </w:rPr>
+              <w:t>4</w:t>
+            </w:r>
+          </w:p>
+        </w:tc>
+        <w:tc>
+          <w:tcPr>
+            <w:tcW w:type="dxa" w:w="2282"/>
+          </w:tcPr>
+          <w:p>
+            <w:pPr>
+              <w:spacing w:before="0" w:after="0"/>
+              <w:jc w:val="both"/>
+            </w:pPr>
+            <w:r>
+              <w:rPr>
+                <w:b w:val="0"/>
+                <w:i w:val="0"/>
+              </w:rPr>
+              <w:t>Radio Văn học: “Mùa xuân chín” (Hàn Mặc Tử) qua lời bình của TS. Chu Văn Sơn</w:t>
+            </w:r>
+          </w:p>
+        </w:tc>
+        <w:tc>
+          <w:tcPr>
+            <w:tcW w:type="dxa" w:w="2282"/>
+          </w:tcPr>
+          <w:p>
+            <w:pPr>
+              <w:spacing w:before="0" w:after="0"/>
+              <w:jc w:val="both"/>
+            </w:pPr>
+            <w:r>
+              <w:rPr>
+                <w:b w:val="0"/>
+                <w:i w:val="0"/>
+              </w:rPr>
+              <w:t>Học Văn Cô Sương Mai</w:t>
+            </w:r>
+          </w:p>
+        </w:tc>
+        <w:tc>
+          <w:tcPr>
+            <w:tcW w:type="dxa" w:w="2282"/>
+          </w:tcPr>
+          <w:p>
+            <w:pPr>
+              <w:spacing w:before="0" w:after="0"/>
+              <w:jc w:val="both"/>
+            </w:pPr>
+            <w:r>
+              <w:rPr>
+                <w:b w:val="0"/>
+                <w:i w:val="0"/>
+              </w:rPr>
+              <w:t>Mở rộng – nghe bình thơ (ở nhà)</w:t>
+            </w:r>
+          </w:p>
+        </w:tc>
+        <w:tc>
+          <w:tcPr>
+            <w:tcW w:type="dxa" w:w="2282"/>
+          </w:tcPr>
+          <w:p>
+            <w:pPr>
+              <w:spacing w:before="0" w:after="0"/>
+              <w:jc w:val="both"/>
+            </w:pPr>
+            <w:r>
+              <w:rPr>
+                <w:b w:val="0"/>
+                <w:i w:val="0"/>
+              </w:rPr>
+              <w:t>https://www.youtube.com/watch?v=0Ff0pYhbatU</w:t>
+            </w:r>
+          </w:p>
+        </w:tc>
+      </w:tr>
+      <w:tr>
+        <w:tc>
+          <w:tcPr>
+            <w:tcW w:type="dxa" w:w="794"/>
+          </w:tcPr>
+          <w:p>
+            <w:pPr>
+              <w:spacing w:before="0" w:after="0"/>
+              <w:jc w:val="both"/>
+            </w:pPr>
+            <w:r>
+              <w:rPr>
+                <w:b w:val="0"/>
+                <w:i w:val="0"/>
+              </w:rPr>
+              <w:t>5</w:t>
+            </w:r>
+          </w:p>
+        </w:tc>
+        <w:tc>
+          <w:tcPr>
+            <w:tcW w:type="dxa" w:w="2282"/>
+          </w:tcPr>
+          <w:p>
+            <w:pPr>
+              <w:spacing w:before="0" w:after="0"/>
+              <w:jc w:val="both"/>
+            </w:pPr>
+            <w:r>
+              <w:rPr>
+                <w:b w:val="0"/>
+                <w:i w:val="0"/>
+              </w:rPr>
+              <w:t>Bài thơ Tiếng thu – Lưu Trọng Lư – Ngọc Sang diễn ngâm</w:t>
+            </w:r>
+          </w:p>
+        </w:tc>
+        <w:tc>
+          <w:tcPr>
+            <w:tcW w:type="dxa" w:w="2282"/>
+          </w:tcPr>
+          <w:p>
+            <w:pPr>
+              <w:spacing w:before="0" w:after="0"/>
+              <w:jc w:val="both"/>
+            </w:pPr>
+            <w:r>
+              <w:rPr>
+                <w:b w:val="0"/>
+                <w:i w:val="0"/>
+              </w:rPr>
+              <w:t>Nghệ sĩ ngâm thơ Ngọc Sang</w:t>
+            </w:r>
+          </w:p>
+        </w:tc>
+        <w:tc>
+          <w:tcPr>
+            <w:tcW w:type="dxa" w:w="2282"/>
+          </w:tcPr>
+          <w:p>
+            <w:pPr>
+              <w:spacing w:before="0" w:after="0"/>
+              <w:jc w:val="both"/>
+            </w:pPr>
+            <w:r>
+              <w:rPr>
+                <w:b w:val="0"/>
+                <w:i w:val="0"/>
+              </w:rPr>
+              <w:t>Mở đầu Văn bản 6 (thay cho bài hát phổ thơ)</w:t>
+            </w:r>
+          </w:p>
+        </w:tc>
+        <w:tc>
+          <w:tcPr>
+            <w:tcW w:type="dxa" w:w="2282"/>
+          </w:tcPr>
+          <w:p>
+            <w:pPr>
+              <w:spacing w:before="0" w:after="0"/>
+              <w:jc w:val="both"/>
+            </w:pPr>
+            <w:r>
+              <w:rPr>
+                <w:b w:val="0"/>
+                <w:i w:val="0"/>
+              </w:rPr>
+              <w:t>https://www.youtube.com/watch?v=c5RVyHI_TeU</w:t>
+            </w:r>
+          </w:p>
+        </w:tc>
+      </w:tr>
+    </w:tbl>
+    <w:p>
+      <w:pPr>
+        <w:spacing w:before="0" w:after="0"/>
+        <w:jc w:val="both"/>
+      </w:pPr>
     </w:p>
     <w:p>
       <w:pPr>

</xml_diff>

<commit_message>
Video học liệu chỉ từ nguồn chính thống; gỡ đề có đáp án (mon/*/trac_nghiem) khỏi kho công khai
Co-Authored-By: Claude Opus 5.5 <noreply@anthropic.com>
</commit_message>
<xml_diff>
--- a/mon/ngu_van/khbd/lop10/KHBD_NGUVAN10_Bai2_VeDepCuaThoCa_T12-22.docx
+++ b/mon/ngu_van/khbd/lop10/KHBD_NGUVAN10_Bai2_VeDepCuaThoCa_T12-22.docx
@@ -723,19 +723,6 @@
           <w:i w:val="0"/>
         </w:rPr>
         <w:t>- GV dẫn vào bài: Có những bài thơ chỉ vỏn vẹn ba dòng mà khiến người đọc nghĩ mãi – đó là thơ hai-cư của Nhật Bản.</w:t>
-      </w:r>
-    </w:p>
-    <w:p>
-      <w:pPr>
-        <w:spacing w:before="0" w:after="0"/>
-        <w:jc w:val="both"/>
-      </w:pPr>
-      <w:r>
-        <w:rPr>
-          <w:b w:val="0"/>
-          <w:i w:val="0"/>
-        </w:rPr>
-        <w:t>- Video tham khảo: Matsuo Bashō – Người khai sáng thơ Haiku Nhật Bản (kênh Người Nổi Tiếng) – https://www.youtube.com/watch?v=uS7Hxn7RKDo – Tìm hiểu tác giả Ba-sô, thể thơ hai-cư</w:t>
       </w:r>
     </w:p>
     <w:p>
@@ -1419,19 +1406,6 @@
           <w:i w:val="0"/>
         </w:rPr>
         <w:t>- GV dẫn vào bài: Mùa thu năm 766, Đỗ Phủ đang phiêu bạt ở Quỳ Châu, ốm đau, khốn khó; chùm Thu hứng ra đời, chất chứa nỗi nhớ quê và nỗi đau thời thế.</w:t>
-      </w:r>
-    </w:p>
-    <w:p>
-      <w:pPr>
-        <w:spacing w:before="0" w:after="0"/>
-        <w:jc w:val="both"/>
-      </w:pPr>
-      <w:r>
-        <w:rPr>
-          <w:b w:val="0"/>
-          <w:i w:val="0"/>
-        </w:rPr>
-        <w:t>- Video tham khảo: Cảm xúc mùa thu (Thu hứng bài 1, Đỗ Phủ) – Ngữ văn 10 KNTT (kênh Học liệu số giáo dục) – https://www.youtube.com/watch?v=WJr3ux-UmG4 – Đọc, tìm hiểu Thu hứng</w:t>
       </w:r>
     </w:p>
     <w:p>
@@ -2613,19 +2587,6 @@
     </w:p>
     <w:p>
       <w:pPr>
-        <w:spacing w:before="0" w:after="0"/>
-        <w:jc w:val="both"/>
-      </w:pPr>
-      <w:r>
-        <w:rPr>
-          <w:b w:val="0"/>
-          <w:i w:val="0"/>
-        </w:rPr>
-        <w:t>- Video tham khảo: Bài thơ Mùa xuân chín – Hàn Mặc Tử – NSƯT Trần Thị Tuyết diễn ngâm (kênh Lê &amp; H) – https://www.youtube.com/watch?v=Qvss02_9RAk – Đọc diễn cảm Mùa xuân chín</w:t>
-      </w:r>
-    </w:p>
-    <w:p>
-      <w:pPr>
         <w:spacing w:before="80" w:after="0"/>
         <w:jc w:val="center"/>
       </w:pPr>
@@ -3145,19 +3106,6 @@
     </w:p>
     <w:p>
       <w:pPr>
-        <w:spacing w:before="0" w:after="0"/>
-        <w:jc w:val="both"/>
-      </w:pPr>
-      <w:r>
-        <w:rPr>
-          <w:b w:val="0"/>
-          <w:i w:val="0"/>
-        </w:rPr>
-        <w:t>- Video tham khảo: Bài thơ Tiếng thu – Lưu Trọng Lư – Ngọc Sang diễn ngâm (kênh Nghệ sĩ ngâm thơ Ngọc Sang) – https://www.youtube.com/watch?v=c5RVyHI_TeU – Mở đầu Văn bản 6 (thay cho bài hát phổ thơ)</w:t>
-      </w:r>
-    </w:p>
-    <w:p>
-      <w:pPr>
         <w:spacing w:before="80" w:after="0"/>
         <w:jc w:val="center"/>
       </w:pPr>
@@ -4263,598 +4211,6 @@
         </w:rPr>
         <w:t>* PHỤ LỤC</w:t>
       </w:r>
-    </w:p>
-    <w:p>
-      <w:pPr>
-        <w:spacing w:before="80" w:after="0"/>
-        <w:jc w:val="center"/>
-      </w:pPr>
-      <w:r>
-        <w:rPr>
-          <w:b/>
-          <w:i w:val="0"/>
-        </w:rPr>
-        <w:t>Học liệu video (đã kiểm tra liên kết)</w:t>
-      </w:r>
-    </w:p>
-    <w:tbl>
-      <w:tblPr>
-        <w:tblStyle w:val="TableGrid"/>
-        <w:tblW w:type="auto" w:w="0"/>
-        <w:jc w:val="center"/>
-        <w:tblLayout w:type="fixed"/>
-        <w:tblLook w:firstColumn="1" w:firstRow="1" w:lastColumn="0" w:lastRow="0" w:noHBand="0" w:noVBand="1" w:val="04A0"/>
-      </w:tblPr>
-      <w:tblGrid>
-        <w:gridCol w:w="1985"/>
-        <w:gridCol w:w="1985"/>
-        <w:gridCol w:w="1985"/>
-        <w:gridCol w:w="1985"/>
-        <w:gridCol w:w="1985"/>
-      </w:tblGrid>
-      <w:tr>
-        <w:tc>
-          <w:tcPr>
-            <w:tcW w:type="dxa" w:w="794"/>
-            <w:shd w:val="clear" w:color="auto" w:fill="DCE6F2"/>
-          </w:tcPr>
-          <w:p>
-            <w:pPr>
-              <w:spacing w:before="80" w:after="0"/>
-              <w:jc w:val="center"/>
-            </w:pPr>
-            <w:r>
-              <w:rPr>
-                <w:b/>
-                <w:i w:val="0"/>
-              </w:rPr>
-              <w:t>STT</w:t>
-            </w:r>
-          </w:p>
-        </w:tc>
-        <w:tc>
-          <w:tcPr>
-            <w:tcW w:type="dxa" w:w="2282"/>
-            <w:shd w:val="clear" w:color="auto" w:fill="DCE6F2"/>
-          </w:tcPr>
-          <w:p>
-            <w:pPr>
-              <w:spacing w:before="80" w:after="0"/>
-              <w:jc w:val="center"/>
-            </w:pPr>
-            <w:r>
-              <w:rPr>
-                <w:b/>
-                <w:i w:val="0"/>
-              </w:rPr>
-              <w:t>Video</w:t>
-            </w:r>
-          </w:p>
-        </w:tc>
-        <w:tc>
-          <w:tcPr>
-            <w:tcW w:type="dxa" w:w="2282"/>
-            <w:shd w:val="clear" w:color="auto" w:fill="DCE6F2"/>
-          </w:tcPr>
-          <w:p>
-            <w:pPr>
-              <w:spacing w:before="80" w:after="0"/>
-              <w:jc w:val="center"/>
-            </w:pPr>
-            <w:r>
-              <w:rPr>
-                <w:b/>
-                <w:i w:val="0"/>
-              </w:rPr>
-              <w:t>Kênh</w:t>
-            </w:r>
-          </w:p>
-        </w:tc>
-        <w:tc>
-          <w:tcPr>
-            <w:tcW w:type="dxa" w:w="2282"/>
-            <w:shd w:val="clear" w:color="auto" w:fill="DCE6F2"/>
-          </w:tcPr>
-          <w:p>
-            <w:pPr>
-              <w:spacing w:before="80" w:after="0"/>
-              <w:jc w:val="center"/>
-            </w:pPr>
-            <w:r>
-              <w:rPr>
-                <w:b/>
-                <w:i w:val="0"/>
-              </w:rPr>
-              <w:t>Dùng ở</w:t>
-            </w:r>
-          </w:p>
-        </w:tc>
-        <w:tc>
-          <w:tcPr>
-            <w:tcW w:type="dxa" w:w="2282"/>
-            <w:shd w:val="clear" w:color="auto" w:fill="DCE6F2"/>
-          </w:tcPr>
-          <w:p>
-            <w:pPr>
-              <w:spacing w:before="80" w:after="0"/>
-              <w:jc w:val="center"/>
-            </w:pPr>
-            <w:r>
-              <w:rPr>
-                <w:b/>
-                <w:i w:val="0"/>
-              </w:rPr>
-              <w:t>Liên kết</w:t>
-            </w:r>
-          </w:p>
-        </w:tc>
-      </w:tr>
-      <w:tr>
-        <w:tc>
-          <w:tcPr>
-            <w:tcW w:type="dxa" w:w="794"/>
-          </w:tcPr>
-          <w:p>
-            <w:pPr>
-              <w:spacing w:before="0" w:after="0"/>
-              <w:jc w:val="both"/>
-            </w:pPr>
-            <w:r>
-              <w:rPr>
-                <w:b w:val="0"/>
-                <w:i w:val="0"/>
-              </w:rPr>
-              <w:t>1</w:t>
-            </w:r>
-          </w:p>
-        </w:tc>
-        <w:tc>
-          <w:tcPr>
-            <w:tcW w:type="dxa" w:w="2282"/>
-          </w:tcPr>
-          <w:p>
-            <w:pPr>
-              <w:spacing w:before="0" w:after="0"/>
-              <w:jc w:val="both"/>
-            </w:pPr>
-            <w:r>
-              <w:rPr>
-                <w:b w:val="0"/>
-                <w:i w:val="0"/>
-              </w:rPr>
-              <w:t>Matsuo Bashō – Người khai sáng thơ Haiku Nhật Bản</w:t>
-            </w:r>
-          </w:p>
-        </w:tc>
-        <w:tc>
-          <w:tcPr>
-            <w:tcW w:type="dxa" w:w="2282"/>
-          </w:tcPr>
-          <w:p>
-            <w:pPr>
-              <w:spacing w:before="0" w:after="0"/>
-              <w:jc w:val="both"/>
-            </w:pPr>
-            <w:r>
-              <w:rPr>
-                <w:b w:val="0"/>
-                <w:i w:val="0"/>
-              </w:rPr>
-              <w:t>Người Nổi Tiếng</w:t>
-            </w:r>
-          </w:p>
-        </w:tc>
-        <w:tc>
-          <w:tcPr>
-            <w:tcW w:type="dxa" w:w="2282"/>
-          </w:tcPr>
-          <w:p>
-            <w:pPr>
-              <w:spacing w:before="0" w:after="0"/>
-              <w:jc w:val="both"/>
-            </w:pPr>
-            <w:r>
-              <w:rPr>
-                <w:b w:val="0"/>
-                <w:i w:val="0"/>
-              </w:rPr>
-              <w:t>Tìm hiểu tác giả Ba-sô, thể thơ hai-cư</w:t>
-            </w:r>
-          </w:p>
-        </w:tc>
-        <w:tc>
-          <w:tcPr>
-            <w:tcW w:type="dxa" w:w="2282"/>
-          </w:tcPr>
-          <w:p>
-            <w:pPr>
-              <w:spacing w:before="0" w:after="0"/>
-              <w:jc w:val="both"/>
-            </w:pPr>
-            <w:r>
-              <w:rPr>
-                <w:b w:val="0"/>
-                <w:i w:val="0"/>
-              </w:rPr>
-              <w:t>https://www.youtube.com/watch?v=uS7Hxn7RKDo</w:t>
-            </w:r>
-          </w:p>
-        </w:tc>
-      </w:tr>
-      <w:tr>
-        <w:tc>
-          <w:tcPr>
-            <w:tcW w:type="dxa" w:w="794"/>
-          </w:tcPr>
-          <w:p>
-            <w:pPr>
-              <w:spacing w:before="0" w:after="0"/>
-              <w:jc w:val="both"/>
-            </w:pPr>
-            <w:r>
-              <w:rPr>
-                <w:b w:val="0"/>
-                <w:i w:val="0"/>
-              </w:rPr>
-              <w:t>2</w:t>
-            </w:r>
-          </w:p>
-        </w:tc>
-        <w:tc>
-          <w:tcPr>
-            <w:tcW w:type="dxa" w:w="2282"/>
-          </w:tcPr>
-          <w:p>
-            <w:pPr>
-              <w:spacing w:before="0" w:after="0"/>
-              <w:jc w:val="both"/>
-            </w:pPr>
-            <w:r>
-              <w:rPr>
-                <w:b w:val="0"/>
-                <w:i w:val="0"/>
-              </w:rPr>
-              <w:t>Cảm xúc mùa thu (Thu hứng bài 1, Đỗ Phủ) – Ngữ văn 10 KNTT</w:t>
-            </w:r>
-          </w:p>
-        </w:tc>
-        <w:tc>
-          <w:tcPr>
-            <w:tcW w:type="dxa" w:w="2282"/>
-          </w:tcPr>
-          <w:p>
-            <w:pPr>
-              <w:spacing w:before="0" w:after="0"/>
-              <w:jc w:val="both"/>
-            </w:pPr>
-            <w:r>
-              <w:rPr>
-                <w:b w:val="0"/>
-                <w:i w:val="0"/>
-              </w:rPr>
-              <w:t>Học liệu số giáo dục</w:t>
-            </w:r>
-          </w:p>
-        </w:tc>
-        <w:tc>
-          <w:tcPr>
-            <w:tcW w:type="dxa" w:w="2282"/>
-          </w:tcPr>
-          <w:p>
-            <w:pPr>
-              <w:spacing w:before="0" w:after="0"/>
-              <w:jc w:val="both"/>
-            </w:pPr>
-            <w:r>
-              <w:rPr>
-                <w:b w:val="0"/>
-                <w:i w:val="0"/>
-              </w:rPr>
-              <w:t>Đọc, tìm hiểu Thu hứng</w:t>
-            </w:r>
-          </w:p>
-        </w:tc>
-        <w:tc>
-          <w:tcPr>
-            <w:tcW w:type="dxa" w:w="2282"/>
-          </w:tcPr>
-          <w:p>
-            <w:pPr>
-              <w:spacing w:before="0" w:after="0"/>
-              <w:jc w:val="both"/>
-            </w:pPr>
-            <w:r>
-              <w:rPr>
-                <w:b w:val="0"/>
-                <w:i w:val="0"/>
-              </w:rPr>
-              <w:t>https://www.youtube.com/watch?v=WJr3ux-UmG4</w:t>
-            </w:r>
-          </w:p>
-        </w:tc>
-      </w:tr>
-      <w:tr>
-        <w:tc>
-          <w:tcPr>
-            <w:tcW w:type="dxa" w:w="794"/>
-          </w:tcPr>
-          <w:p>
-            <w:pPr>
-              <w:spacing w:before="0" w:after="0"/>
-              <w:jc w:val="both"/>
-            </w:pPr>
-            <w:r>
-              <w:rPr>
-                <w:b w:val="0"/>
-                <w:i w:val="0"/>
-              </w:rPr>
-              <w:t>3</w:t>
-            </w:r>
-          </w:p>
-        </w:tc>
-        <w:tc>
-          <w:tcPr>
-            <w:tcW w:type="dxa" w:w="2282"/>
-          </w:tcPr>
-          <w:p>
-            <w:pPr>
-              <w:spacing w:before="0" w:after="0"/>
-              <w:jc w:val="both"/>
-            </w:pPr>
-            <w:r>
-              <w:rPr>
-                <w:b w:val="0"/>
-                <w:i w:val="0"/>
-              </w:rPr>
-              <w:t>Bài thơ Mùa xuân chín – Hàn Mặc Tử – NSƯT Trần Thị Tuyết diễn ngâm</w:t>
-            </w:r>
-          </w:p>
-        </w:tc>
-        <w:tc>
-          <w:tcPr>
-            <w:tcW w:type="dxa" w:w="2282"/>
-          </w:tcPr>
-          <w:p>
-            <w:pPr>
-              <w:spacing w:before="0" w:after="0"/>
-              <w:jc w:val="both"/>
-            </w:pPr>
-            <w:r>
-              <w:rPr>
-                <w:b w:val="0"/>
-                <w:i w:val="0"/>
-              </w:rPr>
-              <w:t>Lê &amp; H</w:t>
-            </w:r>
-          </w:p>
-        </w:tc>
-        <w:tc>
-          <w:tcPr>
-            <w:tcW w:type="dxa" w:w="2282"/>
-          </w:tcPr>
-          <w:p>
-            <w:pPr>
-              <w:spacing w:before="0" w:after="0"/>
-              <w:jc w:val="both"/>
-            </w:pPr>
-            <w:r>
-              <w:rPr>
-                <w:b w:val="0"/>
-                <w:i w:val="0"/>
-              </w:rPr>
-              <w:t>Đọc diễn cảm Mùa xuân chín</w:t>
-            </w:r>
-          </w:p>
-        </w:tc>
-        <w:tc>
-          <w:tcPr>
-            <w:tcW w:type="dxa" w:w="2282"/>
-          </w:tcPr>
-          <w:p>
-            <w:pPr>
-              <w:spacing w:before="0" w:after="0"/>
-              <w:jc w:val="both"/>
-            </w:pPr>
-            <w:r>
-              <w:rPr>
-                <w:b w:val="0"/>
-                <w:i w:val="0"/>
-              </w:rPr>
-              <w:t>https://www.youtube.com/watch?v=Qvss02_9RAk</w:t>
-            </w:r>
-          </w:p>
-        </w:tc>
-      </w:tr>
-      <w:tr>
-        <w:tc>
-          <w:tcPr>
-            <w:tcW w:type="dxa" w:w="794"/>
-          </w:tcPr>
-          <w:p>
-            <w:pPr>
-              <w:spacing w:before="0" w:after="0"/>
-              <w:jc w:val="both"/>
-            </w:pPr>
-            <w:r>
-              <w:rPr>
-                <w:b w:val="0"/>
-                <w:i w:val="0"/>
-              </w:rPr>
-              <w:t>4</w:t>
-            </w:r>
-          </w:p>
-        </w:tc>
-        <w:tc>
-          <w:tcPr>
-            <w:tcW w:type="dxa" w:w="2282"/>
-          </w:tcPr>
-          <w:p>
-            <w:pPr>
-              <w:spacing w:before="0" w:after="0"/>
-              <w:jc w:val="both"/>
-            </w:pPr>
-            <w:r>
-              <w:rPr>
-                <w:b w:val="0"/>
-                <w:i w:val="0"/>
-              </w:rPr>
-              <w:t>Radio Văn học: “Mùa xuân chín” (Hàn Mặc Tử) qua lời bình của TS. Chu Văn Sơn</w:t>
-            </w:r>
-          </w:p>
-        </w:tc>
-        <w:tc>
-          <w:tcPr>
-            <w:tcW w:type="dxa" w:w="2282"/>
-          </w:tcPr>
-          <w:p>
-            <w:pPr>
-              <w:spacing w:before="0" w:after="0"/>
-              <w:jc w:val="both"/>
-            </w:pPr>
-            <w:r>
-              <w:rPr>
-                <w:b w:val="0"/>
-                <w:i w:val="0"/>
-              </w:rPr>
-              <w:t>Học Văn Cô Sương Mai</w:t>
-            </w:r>
-          </w:p>
-        </w:tc>
-        <w:tc>
-          <w:tcPr>
-            <w:tcW w:type="dxa" w:w="2282"/>
-          </w:tcPr>
-          <w:p>
-            <w:pPr>
-              <w:spacing w:before="0" w:after="0"/>
-              <w:jc w:val="both"/>
-            </w:pPr>
-            <w:r>
-              <w:rPr>
-                <w:b w:val="0"/>
-                <w:i w:val="0"/>
-              </w:rPr>
-              <w:t>Mở rộng – nghe bình thơ (ở nhà)</w:t>
-            </w:r>
-          </w:p>
-        </w:tc>
-        <w:tc>
-          <w:tcPr>
-            <w:tcW w:type="dxa" w:w="2282"/>
-          </w:tcPr>
-          <w:p>
-            <w:pPr>
-              <w:spacing w:before="0" w:after="0"/>
-              <w:jc w:val="both"/>
-            </w:pPr>
-            <w:r>
-              <w:rPr>
-                <w:b w:val="0"/>
-                <w:i w:val="0"/>
-              </w:rPr>
-              <w:t>https://www.youtube.com/watch?v=0Ff0pYhbatU</w:t>
-            </w:r>
-          </w:p>
-        </w:tc>
-      </w:tr>
-      <w:tr>
-        <w:tc>
-          <w:tcPr>
-            <w:tcW w:type="dxa" w:w="794"/>
-          </w:tcPr>
-          <w:p>
-            <w:pPr>
-              <w:spacing w:before="0" w:after="0"/>
-              <w:jc w:val="both"/>
-            </w:pPr>
-            <w:r>
-              <w:rPr>
-                <w:b w:val="0"/>
-                <w:i w:val="0"/>
-              </w:rPr>
-              <w:t>5</w:t>
-            </w:r>
-          </w:p>
-        </w:tc>
-        <w:tc>
-          <w:tcPr>
-            <w:tcW w:type="dxa" w:w="2282"/>
-          </w:tcPr>
-          <w:p>
-            <w:pPr>
-              <w:spacing w:before="0" w:after="0"/>
-              <w:jc w:val="both"/>
-            </w:pPr>
-            <w:r>
-              <w:rPr>
-                <w:b w:val="0"/>
-                <w:i w:val="0"/>
-              </w:rPr>
-              <w:t>Bài thơ Tiếng thu – Lưu Trọng Lư – Ngọc Sang diễn ngâm</w:t>
-            </w:r>
-          </w:p>
-        </w:tc>
-        <w:tc>
-          <w:tcPr>
-            <w:tcW w:type="dxa" w:w="2282"/>
-          </w:tcPr>
-          <w:p>
-            <w:pPr>
-              <w:spacing w:before="0" w:after="0"/>
-              <w:jc w:val="both"/>
-            </w:pPr>
-            <w:r>
-              <w:rPr>
-                <w:b w:val="0"/>
-                <w:i w:val="0"/>
-              </w:rPr>
-              <w:t>Nghệ sĩ ngâm thơ Ngọc Sang</w:t>
-            </w:r>
-          </w:p>
-        </w:tc>
-        <w:tc>
-          <w:tcPr>
-            <w:tcW w:type="dxa" w:w="2282"/>
-          </w:tcPr>
-          <w:p>
-            <w:pPr>
-              <w:spacing w:before="0" w:after="0"/>
-              <w:jc w:val="both"/>
-            </w:pPr>
-            <w:r>
-              <w:rPr>
-                <w:b w:val="0"/>
-                <w:i w:val="0"/>
-              </w:rPr>
-              <w:t>Mở đầu Văn bản 6 (thay cho bài hát phổ thơ)</w:t>
-            </w:r>
-          </w:p>
-        </w:tc>
-        <w:tc>
-          <w:tcPr>
-            <w:tcW w:type="dxa" w:w="2282"/>
-          </w:tcPr>
-          <w:p>
-            <w:pPr>
-              <w:spacing w:before="0" w:after="0"/>
-              <w:jc w:val="both"/>
-            </w:pPr>
-            <w:r>
-              <w:rPr>
-                <w:b w:val="0"/>
-                <w:i w:val="0"/>
-              </w:rPr>
-              <w:t>https://www.youtube.com/watch?v=c5RVyHI_TeU</w:t>
-            </w:r>
-          </w:p>
-        </w:tc>
-      </w:tr>
-    </w:tbl>
-    <w:p>
-      <w:pPr>
-        <w:spacing w:before="0" w:after="0"/>
-        <w:jc w:val="both"/>
-      </w:pPr>
     </w:p>
     <w:p>
       <w:pPr>

</xml_diff>